<commit_message>
docs: add direct interactive demo links to Word docx and delete redundant URL demo video
</commit_message>
<xml_diff>
--- a/careproof-ai/docs/CareProof_AI_System_Documentation.docx
+++ b/careproof-ai/docs/CareProof_AI_System_Documentation.docx
@@ -106,6 +106,782 @@
     <w:p>
       <w:pPr>
         <w:spacing w:after="280"/>
+      </w:pPr>
+    </w:p>
+    <w:p>
+      <w:pPr>
+        <w:keepNext/>
+        <w:spacing w:before="360" w:after="120"/>
+      </w:pPr>
+      <w:r>
+        <w:rPr>
+          <w:b/>
+          <w:color w:val="0F172A"/>
+          <w:sz w:val="32"/>
+        </w:rPr>
+        <w:t>Direct Interactive Links to Key Demo Pages</w:t>
+      </w:r>
+    </w:p>
+    <w:p>
+      <w:r>
+        <w:t>The CareProof AI prototype is deployed live on a public HTTPS endpoint and accessible from any desktop or mobile browser. Judges and evaluators can directly access each key feature using the interactive links below:</w:t>
+      </w:r>
+    </w:p>
+    <w:tbl>
+      <w:tblPr>
+        <w:tblW w:type="auto" w:w="0"/>
+        <w:jc w:val="center"/>
+        <w:tblLook w:firstColumn="1" w:firstRow="1" w:lastColumn="0" w:lastRow="0" w:noHBand="0" w:noVBand="1" w:val="04A0"/>
+      </w:tblPr>
+      <w:tblGrid>
+        <w:gridCol w:w="3120"/>
+        <w:gridCol w:w="3120"/>
+        <w:gridCol w:w="3120"/>
+      </w:tblGrid>
+      <w:tr>
+        <w:tc>
+          <w:tcPr>
+            <w:tcW w:type="dxa" w:w="3024"/>
+            <w:shd w:fill="0D9488"/>
+            <w:tcMar>
+              <w:top w:w="120" w:type="dxa"/>
+              <w:bottom w:w="120" w:type="dxa"/>
+              <w:left w:w="120" w:type="dxa"/>
+              <w:right w:w="120" w:type="dxa"/>
+            </w:tcMar>
+          </w:tcPr>
+          <w:p>
+            <w:r>
+              <w:rPr>
+                <w:b/>
+                <w:color w:val="FFFFFF"/>
+                <w:sz w:val="20"/>
+              </w:rPr>
+              <w:t>Page Name &amp; Feature</w:t>
+            </w:r>
+          </w:p>
+        </w:tc>
+        <w:tc>
+          <w:tcPr>
+            <w:tcW w:type="dxa" w:w="3168"/>
+            <w:shd w:fill="0D9488"/>
+            <w:tcMar>
+              <w:top w:w="120" w:type="dxa"/>
+              <w:bottom w:w="120" w:type="dxa"/>
+              <w:left w:w="120" w:type="dxa"/>
+              <w:right w:w="120" w:type="dxa"/>
+            </w:tcMar>
+          </w:tcPr>
+          <w:p>
+            <w:r>
+              <w:rPr>
+                <w:b/>
+                <w:color w:val="FFFFFF"/>
+                <w:sz w:val="20"/>
+              </w:rPr>
+              <w:t>Direct Clickable Link</w:t>
+            </w:r>
+          </w:p>
+        </w:tc>
+        <w:tc>
+          <w:tcPr>
+            <w:tcW w:type="dxa" w:w="3456"/>
+            <w:shd w:fill="0D9488"/>
+            <w:tcMar>
+              <w:top w:w="120" w:type="dxa"/>
+              <w:bottom w:w="120" w:type="dxa"/>
+              <w:left w:w="120" w:type="dxa"/>
+              <w:right w:w="120" w:type="dxa"/>
+            </w:tcMar>
+          </w:tcPr>
+          <w:p>
+            <w:r>
+              <w:rPr>
+                <w:b/>
+                <w:color w:val="FFFFFF"/>
+                <w:sz w:val="20"/>
+              </w:rPr>
+              <w:t>What to Test &amp; Audit</w:t>
+            </w:r>
+          </w:p>
+        </w:tc>
+      </w:tr>
+      <w:tr>
+        <w:tc>
+          <w:tcPr>
+            <w:tcW w:type="dxa" w:w="3120"/>
+            <w:shd w:fill="FFFFFF"/>
+            <w:tcMar>
+              <w:top w:w="100" w:type="dxa"/>
+              <w:bottom w:w="100" w:type="dxa"/>
+              <w:left w:w="120" w:type="dxa"/>
+              <w:right w:w="120" w:type="dxa"/>
+            </w:tcMar>
+          </w:tcPr>
+          <w:p>
+            <w:pPr>
+              <w:spacing w:after="0"/>
+            </w:pPr>
+            <w:r>
+              <w:rPr>
+                <w:b/>
+                <w:sz w:val="19"/>
+              </w:rPr>
+              <w:t>🏠 Live Discovery Grid</w:t>
+            </w:r>
+          </w:p>
+        </w:tc>
+        <w:tc>
+          <w:tcPr>
+            <w:tcW w:type="dxa" w:w="3120"/>
+            <w:shd w:fill="FFFFFF"/>
+            <w:tcMar>
+              <w:top w:w="100" w:type="dxa"/>
+              <w:bottom w:w="100" w:type="dxa"/>
+              <w:left w:w="120" w:type="dxa"/>
+              <w:right w:w="120" w:type="dxa"/>
+            </w:tcMar>
+          </w:tcPr>
+          <w:p>
+            <w:pPr>
+              <w:spacing w:after="0"/>
+            </w:pPr>
+            <w:hyperlink r:id="rId9">
+              <w:r>
+                <w:rPr>
+                  <w:color w:val="0D9488"/>
+                  <w:u w:val="single"/>
+                  <w:b/>
+                </w:rPr>
+                <w:t>Open Live Discovery Grid</w:t>
+              </w:r>
+            </w:hyperlink>
+            <w:r>
+              <w:rPr>
+                <w:color w:val="64748B"/>
+                <w:sz w:val="15"/>
+              </w:rPr>
+              <w:br/>
+              <w:t>https://integrate-europe-compilation-planets.trycloudflare.com/</w:t>
+            </w:r>
+          </w:p>
+        </w:tc>
+        <w:tc>
+          <w:tcPr>
+            <w:tcW w:type="dxa" w:w="3120"/>
+            <w:shd w:fill="FFFFFF"/>
+            <w:tcMar>
+              <w:top w:w="100" w:type="dxa"/>
+              <w:bottom w:w="100" w:type="dxa"/>
+              <w:left w:w="120" w:type="dxa"/>
+              <w:right w:w="120" w:type="dxa"/>
+            </w:tcMar>
+          </w:tcPr>
+          <w:p>
+            <w:pPr>
+              <w:spacing w:after="0"/>
+            </w:pPr>
+            <w:r>
+              <w:rPr>
+                <w:sz w:val="18"/>
+              </w:rPr>
+              <w:t>4 live campaigns showing Active, Target Reached, Discrepancy Flag, and Baby Elroy SMA.</w:t>
+            </w:r>
+          </w:p>
+        </w:tc>
+      </w:tr>
+      <w:tr>
+        <w:tc>
+          <w:tcPr>
+            <w:tcW w:type="dxa" w:w="3120"/>
+            <w:shd w:fill="F0FDFA"/>
+            <w:tcMar>
+              <w:top w:w="100" w:type="dxa"/>
+              <w:bottom w:w="100" w:type="dxa"/>
+              <w:left w:w="120" w:type="dxa"/>
+              <w:right w:w="120" w:type="dxa"/>
+            </w:tcMar>
+          </w:tcPr>
+          <w:p>
+            <w:pPr>
+              <w:spacing w:after="0"/>
+            </w:pPr>
+            <w:r>
+              <w:rPr>
+                <w:b/>
+                <w:sz w:val="19"/>
+              </w:rPr>
+              <w:t>⚡ Rohan Verma Live Escrow</w:t>
+            </w:r>
+          </w:p>
+        </w:tc>
+        <w:tc>
+          <w:tcPr>
+            <w:tcW w:type="dxa" w:w="3120"/>
+            <w:shd w:fill="F0FDFA"/>
+            <w:tcMar>
+              <w:top w:w="100" w:type="dxa"/>
+              <w:bottom w:w="100" w:type="dxa"/>
+              <w:left w:w="120" w:type="dxa"/>
+              <w:right w:w="120" w:type="dxa"/>
+            </w:tcMar>
+          </w:tcPr>
+          <w:p>
+            <w:pPr>
+              <w:spacing w:after="0"/>
+            </w:pPr>
+            <w:hyperlink r:id="rId10">
+              <w:r>
+                <w:rPr>
+                  <w:color w:val="0D9488"/>
+                  <w:u w:val="single"/>
+                  <w:b/>
+                </w:rPr>
+                <w:t>Open Rohan's Campaign</w:t>
+              </w:r>
+            </w:hyperlink>
+            <w:r>
+              <w:rPr>
+                <w:color w:val="64748B"/>
+                <w:sz w:val="15"/>
+              </w:rPr>
+              <w:br/>
+              <w:t>https://integrate-europe-compilation-planets.trycloudflare.com/campaign/cmp_rohan_heart</w:t>
+            </w:r>
+          </w:p>
+        </w:tc>
+        <w:tc>
+          <w:tcPr>
+            <w:tcW w:type="dxa" w:w="3120"/>
+            <w:shd w:fill="F0FDFA"/>
+            <w:tcMar>
+              <w:top w:w="100" w:type="dxa"/>
+              <w:bottom w:w="100" w:type="dxa"/>
+              <w:left w:w="120" w:type="dxa"/>
+              <w:right w:w="120" w:type="dxa"/>
+            </w:tcMar>
+          </w:tcPr>
+          <w:p>
+            <w:pPr>
+              <w:spacing w:after="0"/>
+            </w:pPr>
+            <w:r>
+              <w:rPr>
+                <w:sz w:val="18"/>
+              </w:rPr>
+              <w:t>Direct Apollo Escrow (#ESCROW-APOLLO). Click 'Test Overfunding Protection' to see 100% cap &amp; pool routing.</w:t>
+            </w:r>
+          </w:p>
+        </w:tc>
+      </w:tr>
+      <w:tr>
+        <w:tc>
+          <w:tcPr>
+            <w:tcW w:type="dxa" w:w="3120"/>
+            <w:shd w:fill="FFFFFF"/>
+            <w:tcMar>
+              <w:top w:w="100" w:type="dxa"/>
+              <w:bottom w:w="100" w:type="dxa"/>
+              <w:left w:w="120" w:type="dxa"/>
+              <w:right w:w="120" w:type="dxa"/>
+            </w:tcMar>
+          </w:tcPr>
+          <w:p>
+            <w:pPr>
+              <w:spacing w:after="0"/>
+            </w:pPr>
+            <w:r>
+              <w:rPr>
+                <w:b/>
+                <w:sz w:val="19"/>
+              </w:rPr>
+              <w:t>🎬 Gemini Creator Studio</w:t>
+            </w:r>
+          </w:p>
+        </w:tc>
+        <w:tc>
+          <w:tcPr>
+            <w:tcW w:type="dxa" w:w="3120"/>
+            <w:shd w:fill="FFFFFF"/>
+            <w:tcMar>
+              <w:top w:w="100" w:type="dxa"/>
+              <w:bottom w:w="100" w:type="dxa"/>
+              <w:left w:w="120" w:type="dxa"/>
+              <w:right w:w="120" w:type="dxa"/>
+            </w:tcMar>
+          </w:tcPr>
+          <w:p>
+            <w:pPr>
+              <w:spacing w:after="0"/>
+            </w:pPr>
+            <w:hyperlink r:id="rId11">
+              <w:r>
+                <w:rPr>
+                  <w:color w:val="0D9488"/>
+                  <w:u w:val="single"/>
+                  <w:b/>
+                </w:rPr>
+                <w:t>Open Creator Studio</w:t>
+              </w:r>
+            </w:hyperlink>
+            <w:r>
+              <w:rPr>
+                <w:color w:val="64748B"/>
+                <w:sz w:val="15"/>
+              </w:rPr>
+              <w:br/>
+              <w:t>https://integrate-europe-compilation-planets.trycloudflare.com/creator-studio</w:t>
+            </w:r>
+          </w:p>
+        </w:tc>
+        <w:tc>
+          <w:tcPr>
+            <w:tcW w:type="dxa" w:w="3120"/>
+            <w:shd w:fill="FFFFFF"/>
+            <w:tcMar>
+              <w:top w:w="100" w:type="dxa"/>
+              <w:bottom w:w="100" w:type="dxa"/>
+              <w:left w:w="120" w:type="dxa"/>
+              <w:right w:w="120" w:type="dxa"/>
+            </w:tcMar>
+          </w:tcPr>
+          <w:p>
+            <w:pPr>
+              <w:spacing w:after="0"/>
+            </w:pPr>
+            <w:r>
+              <w:rPr>
+                <w:sz w:val="18"/>
+              </w:rPr>
+              <w:t>Generate multilingual 9:16 vertical Reel scripts in Hindi, Spanish, or Tamil with smartphone mockup.</w:t>
+            </w:r>
+          </w:p>
+        </w:tc>
+      </w:tr>
+      <w:tr>
+        <w:tc>
+          <w:tcPr>
+            <w:tcW w:type="dxa" w:w="3120"/>
+            <w:shd w:fill="F0FDFA"/>
+            <w:tcMar>
+              <w:top w:w="100" w:type="dxa"/>
+              <w:bottom w:w="100" w:type="dxa"/>
+              <w:left w:w="120" w:type="dxa"/>
+              <w:right w:w="120" w:type="dxa"/>
+            </w:tcMar>
+          </w:tcPr>
+          <w:p>
+            <w:pPr>
+              <w:spacing w:after="0"/>
+            </w:pPr>
+            <w:r>
+              <w:rPr>
+                <w:b/>
+                <w:sz w:val="19"/>
+              </w:rPr>
+              <w:t>🔍 Viral Story Scanner (Tab 5)</w:t>
+            </w:r>
+          </w:p>
+        </w:tc>
+        <w:tc>
+          <w:tcPr>
+            <w:tcW w:type="dxa" w:w="3120"/>
+            <w:shd w:fill="F0FDFA"/>
+            <w:tcMar>
+              <w:top w:w="100" w:type="dxa"/>
+              <w:bottom w:w="100" w:type="dxa"/>
+              <w:left w:w="120" w:type="dxa"/>
+              <w:right w:w="120" w:type="dxa"/>
+            </w:tcMar>
+          </w:tcPr>
+          <w:p>
+            <w:pPr>
+              <w:spacing w:after="0"/>
+            </w:pPr>
+            <w:hyperlink r:id="rId12">
+              <w:r>
+                <w:rPr>
+                  <w:color w:val="0D9488"/>
+                  <w:u w:val="single"/>
+                  <w:b/>
+                </w:rPr>
+                <w:t>Open Flyer Scanner (Tab 5)</w:t>
+              </w:r>
+            </w:hyperlink>
+            <w:r>
+              <w:rPr>
+                <w:color w:val="64748B"/>
+                <w:sz w:val="15"/>
+              </w:rPr>
+              <w:br/>
+              <w:t>https://integrate-europe-compilation-planets.trycloudflare.com/creator-studio?tab=scanner</w:t>
+            </w:r>
+          </w:p>
+        </w:tc>
+        <w:tc>
+          <w:tcPr>
+            <w:tcW w:type="dxa" w:w="3120"/>
+            <w:shd w:fill="F0FDFA"/>
+            <w:tcMar>
+              <w:top w:w="100" w:type="dxa"/>
+              <w:bottom w:w="100" w:type="dxa"/>
+              <w:left w:w="120" w:type="dxa"/>
+              <w:right w:w="120" w:type="dxa"/>
+            </w:tcMar>
+          </w:tcPr>
+          <w:p>
+            <w:pPr>
+              <w:spacing w:after="0"/>
+            </w:pPr>
+            <w:r>
+              <w:rPr>
+                <w:sz w:val="18"/>
+              </w:rPr>
+              <w:t>Upload Instagram flyer to see Gemini Vision detect personal UPI (limsontt1@fbl) &amp; convert to escrow.</w:t>
+            </w:r>
+          </w:p>
+        </w:tc>
+      </w:tr>
+      <w:tr>
+        <w:tc>
+          <w:tcPr>
+            <w:tcW w:type="dxa" w:w="3120"/>
+            <w:shd w:fill="FFFFFF"/>
+            <w:tcMar>
+              <w:top w:w="100" w:type="dxa"/>
+              <w:bottom w:w="100" w:type="dxa"/>
+              <w:left w:w="120" w:type="dxa"/>
+              <w:right w:w="120" w:type="dxa"/>
+            </w:tcMar>
+          </w:tcPr>
+          <w:p>
+            <w:pPr>
+              <w:spacing w:after="0"/>
+            </w:pPr>
+            <w:r>
+              <w:rPr>
+                <w:b/>
+                <w:sz w:val="19"/>
+              </w:rPr>
+              <w:t>🩺 Verifier Copilot (HITL)</w:t>
+            </w:r>
+          </w:p>
+        </w:tc>
+        <w:tc>
+          <w:tcPr>
+            <w:tcW w:type="dxa" w:w="3120"/>
+            <w:shd w:fill="FFFFFF"/>
+            <w:tcMar>
+              <w:top w:w="100" w:type="dxa"/>
+              <w:bottom w:w="100" w:type="dxa"/>
+              <w:left w:w="120" w:type="dxa"/>
+              <w:right w:w="120" w:type="dxa"/>
+            </w:tcMar>
+          </w:tcPr>
+          <w:p>
+            <w:pPr>
+              <w:spacing w:after="0"/>
+            </w:pPr>
+            <w:hyperlink r:id="rId13">
+              <w:r>
+                <w:rPr>
+                  <w:color w:val="0D9488"/>
+                  <w:u w:val="single"/>
+                  <w:b/>
+                </w:rPr>
+                <w:t>Open Verifier Dashboard</w:t>
+              </w:r>
+            </w:hyperlink>
+            <w:r>
+              <w:rPr>
+                <w:color w:val="64748B"/>
+                <w:sz w:val="15"/>
+              </w:rPr>
+              <w:br/>
+              <w:t>https://integrate-europe-compilation-planets.trycloudflare.com/verifier</w:t>
+            </w:r>
+          </w:p>
+        </w:tc>
+        <w:tc>
+          <w:tcPr>
+            <w:tcW w:type="dxa" w:w="3120"/>
+            <w:shd w:fill="FFFFFF"/>
+            <w:tcMar>
+              <w:top w:w="100" w:type="dxa"/>
+              <w:bottom w:w="100" w:type="dxa"/>
+              <w:left w:w="120" w:type="dxa"/>
+              <w:right w:w="120" w:type="dxa"/>
+            </w:tcMar>
+          </w:tcPr>
+          <w:p>
+            <w:pPr>
+              <w:spacing w:after="0"/>
+            </w:pPr>
+            <w:r>
+              <w:rPr>
+                <w:sz w:val="18"/>
+              </w:rPr>
+              <w:t>Audit Vikram Singh's +89.2% invoice discrepancy ($35k vs $18.5k quote) and sign SHA-256 certificate.</w:t>
+            </w:r>
+          </w:p>
+        </w:tc>
+      </w:tr>
+      <w:tr>
+        <w:tc>
+          <w:tcPr>
+            <w:tcW w:type="dxa" w:w="3120"/>
+            <w:shd w:fill="F0FDFA"/>
+            <w:tcMar>
+              <w:top w:w="100" w:type="dxa"/>
+              <w:bottom w:w="100" w:type="dxa"/>
+              <w:left w:w="120" w:type="dxa"/>
+              <w:right w:w="120" w:type="dxa"/>
+            </w:tcMar>
+          </w:tcPr>
+          <w:p>
+            <w:pPr>
+              <w:spacing w:after="0"/>
+            </w:pPr>
+            <w:r>
+              <w:rPr>
+                <w:b/>
+                <w:sz w:val="19"/>
+              </w:rPr>
+              <w:t>🏥 Hospital Escrow Portal</w:t>
+            </w:r>
+          </w:p>
+        </w:tc>
+        <w:tc>
+          <w:tcPr>
+            <w:tcW w:type="dxa" w:w="3120"/>
+            <w:shd w:fill="F0FDFA"/>
+            <w:tcMar>
+              <w:top w:w="100" w:type="dxa"/>
+              <w:bottom w:w="100" w:type="dxa"/>
+              <w:left w:w="120" w:type="dxa"/>
+              <w:right w:w="120" w:type="dxa"/>
+            </w:tcMar>
+          </w:tcPr>
+          <w:p>
+            <w:pPr>
+              <w:spacing w:after="0"/>
+            </w:pPr>
+            <w:hyperlink r:id="rId14">
+              <w:r>
+                <w:rPr>
+                  <w:color w:val="0D9488"/>
+                  <w:u w:val="single"/>
+                  <w:b/>
+                </w:rPr>
+                <w:t>Open Hospital Ledger</w:t>
+              </w:r>
+            </w:hyperlink>
+            <w:r>
+              <w:rPr>
+                <w:color w:val="64748B"/>
+                <w:sz w:val="15"/>
+              </w:rPr>
+              <w:br/>
+              <w:t>https://integrate-europe-compilation-planets.trycloudflare.com/hospital-escrow</w:t>
+            </w:r>
+          </w:p>
+        </w:tc>
+        <w:tc>
+          <w:tcPr>
+            <w:tcW w:type="dxa" w:w="3120"/>
+            <w:shd w:fill="F0FDFA"/>
+            <w:tcMar>
+              <w:top w:w="100" w:type="dxa"/>
+              <w:bottom w:w="100" w:type="dxa"/>
+              <w:left w:w="120" w:type="dxa"/>
+              <w:right w:w="120" w:type="dxa"/>
+            </w:tcMar>
+          </w:tcPr>
+          <w:p>
+            <w:pPr>
+              <w:spacing w:after="0"/>
+            </w:pPr>
+            <w:r>
+              <w:rPr>
+                <w:sz w:val="18"/>
+              </w:rPr>
+              <w:t>Apollo inward settlement ledger with cryptographic receipt hashes (CP-REC-XXXXX) &amp; pediatric pool funds.</w:t>
+            </w:r>
+          </w:p>
+        </w:tc>
+      </w:tr>
+      <w:tr>
+        <w:tc>
+          <w:tcPr>
+            <w:tcW w:type="dxa" w:w="3120"/>
+            <w:shd w:fill="FFFFFF"/>
+            <w:tcMar>
+              <w:top w:w="100" w:type="dxa"/>
+              <w:bottom w:w="100" w:type="dxa"/>
+              <w:left w:w="120" w:type="dxa"/>
+              <w:right w:w="120" w:type="dxa"/>
+            </w:tcMar>
+          </w:tcPr>
+          <w:p>
+            <w:pPr>
+              <w:spacing w:after="0"/>
+            </w:pPr>
+            <w:r>
+              <w:rPr>
+                <w:b/>
+                <w:sz w:val="19"/>
+              </w:rPr>
+              <w:t>🤖 Health API &amp; Liveness Probe</w:t>
+            </w:r>
+          </w:p>
+        </w:tc>
+        <w:tc>
+          <w:tcPr>
+            <w:tcW w:type="dxa" w:w="3120"/>
+            <w:shd w:fill="FFFFFF"/>
+            <w:tcMar>
+              <w:top w:w="100" w:type="dxa"/>
+              <w:bottom w:w="100" w:type="dxa"/>
+              <w:left w:w="120" w:type="dxa"/>
+              <w:right w:w="120" w:type="dxa"/>
+            </w:tcMar>
+          </w:tcPr>
+          <w:p>
+            <w:pPr>
+              <w:spacing w:after="0"/>
+            </w:pPr>
+            <w:hyperlink r:id="rId15">
+              <w:r>
+                <w:rPr>
+                  <w:color w:val="0D9488"/>
+                  <w:u w:val="single"/>
+                  <w:b/>
+                </w:rPr>
+                <w:t>Open Health API (/healthz)</w:t>
+              </w:r>
+            </w:hyperlink>
+            <w:r>
+              <w:rPr>
+                <w:color w:val="64748B"/>
+                <w:sz w:val="15"/>
+              </w:rPr>
+              <w:br/>
+              <w:t>https://integrate-europe-compilation-planets.trycloudflare.com/healthz</w:t>
+            </w:r>
+          </w:p>
+        </w:tc>
+        <w:tc>
+          <w:tcPr>
+            <w:tcW w:type="dxa" w:w="3120"/>
+            <w:shd w:fill="FFFFFF"/>
+            <w:tcMar>
+              <w:top w:w="100" w:type="dxa"/>
+              <w:bottom w:w="100" w:type="dxa"/>
+              <w:left w:w="120" w:type="dxa"/>
+              <w:right w:w="120" w:type="dxa"/>
+            </w:tcMar>
+          </w:tcPr>
+          <w:p>
+            <w:pPr>
+              <w:spacing w:after="0"/>
+            </w:pPr>
+            <w:r>
+              <w:rPr>
+                <w:sz w:val="18"/>
+              </w:rPr>
+              <w:t>Machine-readable JSON status endpoint powering Google Cloud Run automated liveness probes.</w:t>
+            </w:r>
+          </w:p>
+        </w:tc>
+      </w:tr>
+      <w:tr>
+        <w:tc>
+          <w:tcPr>
+            <w:tcW w:type="dxa" w:w="3120"/>
+            <w:shd w:fill="F0FDFA"/>
+            <w:tcMar>
+              <w:top w:w="100" w:type="dxa"/>
+              <w:bottom w:w="100" w:type="dxa"/>
+              <w:left w:w="120" w:type="dxa"/>
+              <w:right w:w="120" w:type="dxa"/>
+            </w:tcMar>
+          </w:tcPr>
+          <w:p>
+            <w:pPr>
+              <w:spacing w:after="0"/>
+            </w:pPr>
+            <w:r>
+              <w:rPr>
+                <w:b/>
+                <w:sz w:val="19"/>
+              </w:rPr>
+              <w:t>🐙 GitHub Source Code Repository</w:t>
+            </w:r>
+          </w:p>
+        </w:tc>
+        <w:tc>
+          <w:tcPr>
+            <w:tcW w:type="dxa" w:w="3120"/>
+            <w:shd w:fill="F0FDFA"/>
+            <w:tcMar>
+              <w:top w:w="100" w:type="dxa"/>
+              <w:bottom w:w="100" w:type="dxa"/>
+              <w:left w:w="120" w:type="dxa"/>
+              <w:right w:w="120" w:type="dxa"/>
+            </w:tcMar>
+          </w:tcPr>
+          <w:p>
+            <w:pPr>
+              <w:spacing w:after="0"/>
+            </w:pPr>
+            <w:hyperlink r:id="rId16">
+              <w:r>
+                <w:rPr>
+                  <w:color w:val="0D9488"/>
+                  <w:u w:val="single"/>
+                  <w:b/>
+                </w:rPr>
+                <w:t>GitHub Repository</w:t>
+              </w:r>
+            </w:hyperlink>
+            <w:r>
+              <w:rPr>
+                <w:color w:val="64748B"/>
+                <w:sz w:val="15"/>
+              </w:rPr>
+              <w:br/>
+              <w:t>https://github.com/prabhasuria/The_404_Brigade</w:t>
+            </w:r>
+          </w:p>
+        </w:tc>
+        <w:tc>
+          <w:tcPr>
+            <w:tcW w:type="dxa" w:w="3120"/>
+            <w:shd w:fill="F0FDFA"/>
+            <w:tcMar>
+              <w:top w:w="100" w:type="dxa"/>
+              <w:bottom w:w="100" w:type="dxa"/>
+              <w:left w:w="120" w:type="dxa"/>
+              <w:right w:w="120" w:type="dxa"/>
+            </w:tcMar>
+          </w:tcPr>
+          <w:p>
+            <w:pPr>
+              <w:spacing w:after="0"/>
+            </w:pPr>
+            <w:r>
+              <w:rPr>
+                <w:sz w:val="18"/>
+              </w:rPr>
+              <w:t>Complete open-source codebase, test suites, documentation, and deployment manifests.</w:t>
+            </w:r>
+          </w:p>
+        </w:tc>
+      </w:tr>
+    </w:tbl>
+    <w:p>
+      <w:pPr>
+        <w:spacing w:after="240"/>
       </w:pPr>
     </w:p>
     <w:p>
@@ -1428,14 +2204,26 @@
     </w:p>
     <w:p>
       <w:pPr>
-        <w:spacing w:before="120" w:after="40"/>
+        <w:spacing w:before="160" w:after="40"/>
       </w:pPr>
       <w:r>
         <w:rPr>
           <w:b/>
-          <w:color w:val="0D9488"/>
+          <w:color w:val="0F172A"/>
         </w:rPr>
-        <w:t>Step 1: Campaign Discovery &amp; Lifecycle States (/)</w:t>
+        <w:t xml:space="preserve">Step 1: Campaign Discovery &amp; Lifecycle States — </w:t>
+      </w:r>
+      <w:hyperlink r:id="rId9">
+        <w:r>
+          <w:rPr>
+            <w:color w:val="0D9488"/>
+            <w:u w:val="single"/>
+            <w:b/>
+          </w:rPr>
+          <w:t>[Click to Open Live Page]</w:t>
+        </w:r>
+      </w:hyperlink>
+      <w:r>
         <w:br/>
       </w:r>
       <w:r>
@@ -1447,14 +2235,26 @@
     </w:p>
     <w:p>
       <w:pPr>
-        <w:spacing w:before="120" w:after="40"/>
+        <w:spacing w:before="160" w:after="40"/>
       </w:pPr>
       <w:r>
         <w:rPr>
           <w:b/>
-          <w:color w:val="0D9488"/>
+          <w:color w:val="0F172A"/>
         </w:rPr>
-        <w:t>Step 2: Real-Time Donation &amp; Mutex Auto-Lock (/campaign/cmp_rohan_heart)</w:t>
+        <w:t xml:space="preserve">Step 2: Real-Time Donation &amp; Mutex Auto-Lock — </w:t>
+      </w:r>
+      <w:hyperlink r:id="rId10">
+        <w:r>
+          <w:rPr>
+            <w:color w:val="0D9488"/>
+            <w:u w:val="single"/>
+            <w:b/>
+          </w:rPr>
+          <w:t>[Click to Open Live Page]</w:t>
+        </w:r>
+      </w:hyperlink>
+      <w:r>
         <w:br/>
       </w:r>
       <w:r>
@@ -1466,14 +2266,26 @@
     </w:p>
     <w:p>
       <w:pPr>
-        <w:spacing w:before="120" w:after="40"/>
+        <w:spacing w:before="160" w:after="40"/>
       </w:pPr>
       <w:r>
         <w:rPr>
           <w:b/>
-          <w:color w:val="0D9488"/>
+          <w:color w:val="0F172A"/>
         </w:rPr>
-        <w:t>Step 3: Gemini Multilingual Creator Studio (/creator-studio)</w:t>
+        <w:t xml:space="preserve">Step 3: Gemini Multilingual Creator Studio — </w:t>
+      </w:r>
+      <w:hyperlink r:id="rId11">
+        <w:r>
+          <w:rPr>
+            <w:color w:val="0D9488"/>
+            <w:u w:val="single"/>
+            <w:b/>
+          </w:rPr>
+          <w:t>[Click to Open Live Page]</w:t>
+        </w:r>
+      </w:hyperlink>
+      <w:r>
         <w:br/>
       </w:r>
       <w:r>
@@ -1485,14 +2297,26 @@
     </w:p>
     <w:p>
       <w:pPr>
-        <w:spacing w:before="120" w:after="40"/>
+        <w:spacing w:before="160" w:after="40"/>
       </w:pPr>
       <w:r>
         <w:rPr>
           <w:b/>
-          <w:color w:val="0D9488"/>
+          <w:color w:val="0F172A"/>
         </w:rPr>
-        <w:t>Step 4: Viral Story Scanner (Tab 5 of Creator Studio)</w:t>
+        <w:t xml:space="preserve">Step 4: Viral Story Scanner (Tab 5 of Creator Studio) — </w:t>
+      </w:r>
+      <w:hyperlink r:id="rId12">
+        <w:r>
+          <w:rPr>
+            <w:color w:val="0D9488"/>
+            <w:u w:val="single"/>
+            <w:b/>
+          </w:rPr>
+          <w:t>[Click to Open Live Page]</w:t>
+        </w:r>
+      </w:hyperlink>
+      <w:r>
         <w:br/>
       </w:r>
       <w:r>
@@ -1504,14 +2328,26 @@
     </w:p>
     <w:p>
       <w:pPr>
-        <w:spacing w:before="120" w:after="40"/>
+        <w:spacing w:before="160" w:after="40"/>
       </w:pPr>
       <w:r>
         <w:rPr>
           <w:b/>
-          <w:color w:val="0D9488"/>
+          <w:color w:val="0F172A"/>
         </w:rPr>
-        <w:t>Step 5: Verifier Copilot &amp; Hospital Settlement Ledger (/verifier &amp; /hospital-escrow)</w:t>
+        <w:t xml:space="preserve">Step 5: Verifier Copilot &amp; Hospital Settlement Ledger — </w:t>
+      </w:r>
+      <w:hyperlink r:id="rId13">
+        <w:r>
+          <w:rPr>
+            <w:color w:val="0D9488"/>
+            <w:u w:val="single"/>
+            <w:b/>
+          </w:rPr>
+          <w:t>[Click to Open Live Page]</w:t>
+        </w:r>
+      </w:hyperlink>
+      <w:r>
         <w:br/>
       </w:r>
       <w:r>

</xml_diff>